<commit_message>
feat(c18): FILM corp narativ integral pe axa C18 (L200)
Reautorat corpul FILM (DESCHIDERE + ROLURI + SCENA 7 fenomene->capcane falsa-automatizare
+ 6 etape x 8 campuri: OBIECTIV/STARE/VOCEA/DEMONSTRATIE/INTERVENTIE AI/CONTROL/REVEAL/
TRANZITIE + FINAL). 0 reziduuri C01. Power Query mentionat doar ca MIJLOC (corect SPEC).
Predare catre C19. audit_sync: C18 trece tot mai putin imgclone (imagini c01).
</commit_message>
<xml_diff>
--- a/c18/FILM-Excel-18-Automatizare.docx
+++ b/c18/FILM-Excel-18-Automatizare.docx
@@ -349,7 +349,7 @@
           <w:rFonts w:ascii="Calibri" w:hAnsi="Calibri"/>
           <w:sz w:val="20"/>
         </w:rPr>
-        <w:t>Este acesta cu adevărat un tabel?</w:t>
+        <w:t>Ce mai trece prin mâinile tale la fiecare ciclu?</w:t>
       </w:r>
     </w:p>
     <w:p>
@@ -374,7 +374,7 @@
           <w:rFonts w:ascii="Calibri" w:hAnsi="Calibri"/>
           <w:sz w:val="20"/>
         </w:rPr>
-        <w:t>Un export poate avea aspectul unui tabel Excel și totuși să nu respecte regulile unui tabel real. În această construcție demonstrăm diferența dintre aparență și structură.</w:t>
+        <w:t>O muncă poate avea deja un sistem (C17) și totuși să ceară mâna ta la fiecare ciclu. În această construcție scoatem execuția repetitivă din mâinile autorului, fără să pretindem că se face singură.</w:t>
       </w:r>
     </w:p>
     <w:p>
@@ -399,7 +399,7 @@
           <w:rFonts w:ascii="Calibri" w:hAnsi="Calibri"/>
           <w:sz w:val="20"/>
         </w:rPr>
-        <w:t>Un export poate avea aspectul unui tabel Excel și totuși să încalce regulile fundamentale ale unei structuri controlabile. Dacă fundația este greșită, toate construcțiile ulterioare moștenesc eroarea.</w:t>
+        <w:t>Câtă vreme fiecare ciclu trece prin mâinile autorului, omul devine plafonul: cât poate el executa, atât se face. Timpul de judecată e mâncat de timpul de execuție.</w:t>
       </w:r>
     </w:p>
     <w:p>
@@ -424,7 +424,7 @@
           <w:rFonts w:ascii="Calibri" w:hAnsi="Calibri"/>
           <w:sz w:val="20"/>
         </w:rPr>
-        <w:t>• subtotaluri amestecate cu date</w:t>
+        <w:t>• același lanț de pași, refăcut cu mâna la fiecare ciclu</w:t>
       </w:r>
     </w:p>
     <w:p>
@@ -436,7 +436,7 @@
           <w:rFonts w:ascii="Calibri" w:hAnsi="Calibri"/>
           <w:sz w:val="20"/>
         </w:rPr>
-        <w:t>• celule unite</w:t>
+        <w:t>• tu pornești de fiecare dată</w:t>
       </w:r>
     </w:p>
     <w:p>
@@ -448,7 +448,7 @@
           <w:rFonts w:ascii="Calibri" w:hAnsi="Calibri"/>
           <w:sz w:val="20"/>
         </w:rPr>
-        <w:t>• coloane ascunse</w:t>
+        <w:t>• ciclul așteaptă după tine când ești ocupat</w:t>
       </w:r>
     </w:p>
     <w:p>
@@ -460,7 +460,7 @@
           <w:rFonts w:ascii="Calibri" w:hAnsi="Calibri"/>
           <w:sz w:val="20"/>
         </w:rPr>
-        <w:t>• separatoare artificiale</w:t>
+        <w:t>• variații strecurate de la un ciclu la altul</w:t>
       </w:r>
     </w:p>
     <w:p>
@@ -485,7 +485,7 @@
           <w:rFonts w:ascii="Calibri" w:hAnsi="Calibri"/>
           <w:sz w:val="20"/>
         </w:rPr>
-        <w:t>• tabel valid</w:t>
+        <w:t>• lanț pornit dintr-o atingere</w:t>
       </w:r>
     </w:p>
     <w:p>
@@ -497,7 +497,7 @@
           <w:rFonts w:ascii="Calibri" w:hAnsi="Calibri"/>
           <w:sz w:val="20"/>
         </w:rPr>
-        <w:t>• structură continuă</w:t>
+        <w:t>• pași eliminați din execuție</w:t>
       </w:r>
     </w:p>
     <w:p>
@@ -509,7 +509,7 @@
           <w:rFonts w:ascii="Calibri" w:hAnsi="Calibri"/>
           <w:sz w:val="20"/>
         </w:rPr>
-        <w:t>• bază pentru formule</w:t>
+        <w:t>• un singur punct de intervenție</w:t>
       </w:r>
     </w:p>
     <w:p>
@@ -521,7 +521,7 @@
           <w:rFonts w:ascii="Calibri" w:hAnsi="Calibri"/>
           <w:sz w:val="20"/>
         </w:rPr>
-        <w:t>• bază pentru Power Query</w:t>
+        <w:t>• motor care merge fără tine</w:t>
       </w:r>
     </w:p>
     <w:p>
@@ -546,7 +546,7 @@
           <w:rFonts w:ascii="Calibri" w:hAnsi="Calibri"/>
           <w:sz w:val="20"/>
         </w:rPr>
-        <w:t>✓ structură controlabilă</w:t>
+        <w:t>✓ un lanț automatizat</w:t>
       </w:r>
     </w:p>
     <w:p>
@@ -558,7 +558,7 @@
           <w:rFonts w:ascii="Calibri" w:hAnsi="Calibri"/>
           <w:sz w:val="20"/>
         </w:rPr>
-        <w:t>✓ tabel validat</w:t>
+        <w:t>✓ pași scoși din mâinile tale</w:t>
       </w:r>
     </w:p>
     <w:p>
@@ -570,7 +570,7 @@
           <w:rFonts w:ascii="Calibri" w:hAnsi="Calibri"/>
           <w:sz w:val="20"/>
         </w:rPr>
-        <w:t>✓ bază pentru T1 complet</w:t>
+        <w:t>✓ o intervenție minimă marcată</w:t>
       </w:r>
     </w:p>
     <w:p>
@@ -582,7 +582,7 @@
           <w:rFonts w:ascii="Calibri" w:hAnsi="Calibri"/>
           <w:sz w:val="20"/>
         </w:rPr>
-        <w:t>✓ bază pentru T2</w:t>
+        <w:t>✓ bază pentru C19 guvernare</w:t>
       </w:r>
     </w:p>
     <w:p>
@@ -617,7 +617,7 @@
           <w:rFonts w:ascii="Calibri" w:hAnsi="Calibri"/>
           <w:sz w:val="20"/>
         </w:rPr>
-        <w:t>Nu mai vezi tabele. Vezi structuri.</w:t>
+        <w:t>Nu mai ești omul care execută munca. Ești omul care o pune în mișcare.</w:t>
       </w:r>
     </w:p>
     <w:p>
@@ -642,7 +642,7 @@
           <w:rFonts w:ascii="Calibri" w:hAnsi="Calibri"/>
           <w:sz w:val="20"/>
         </w:rPr>
-        <w:t>Poți identifica în mai puțin de 30 de secunde dacă un export ERP este utilizabil sau trebuie restructurat înainte de analiză.</w:t>
+        <w:t>Poți scoate munca recurentă din mâinile tale: un lanț pornit dintr-o atingere, cu un singur punct unde mai intri tu.</w:t>
       </w:r>
     </w:p>
     <w:p>
@@ -667,7 +667,7 @@
           <w:rFonts w:ascii="Calibri" w:hAnsi="Calibri"/>
           <w:sz w:val="20"/>
         </w:rPr>
-        <w:t>Nu mai vezi tabele. Vezi structuri.</w:t>
+        <w:t>Nu mai ești omul care execută munca. Ești omul care o pune în mișcare.</w:t>
       </w:r>
     </w:p>
     <w:p>
@@ -679,7 +679,7 @@
           <w:rFonts w:ascii="Calibri" w:hAnsi="Calibri"/>
           <w:sz w:val="20"/>
         </w:rPr>
-        <w:t>Nu mai verifici cifre. Verifici fundația.</w:t>
+        <w:t>Nu mai execuți la fiecare ciclu. Lași lanțul să ruleze.</w:t>
       </w:r>
     </w:p>
     <w:p>
@@ -691,7 +691,7 @@
           <w:rFonts w:ascii="Calibri" w:hAnsi="Calibri"/>
           <w:sz w:val="20"/>
         </w:rPr>
-        <w:t>Nu mai întrebi „ce formulă folosesc?". Întrebi „pe ce structură construiesc?".</w:t>
+        <w:t>Nu mai întrebi „cât durează ciclul?". Întrebi „ce mai trece prin mâinile mele?".</w:t>
       </w:r>
     </w:p>
     <w:p>
@@ -739,7 +739,7 @@
           <w:b w:val="0"/>
           <w:sz w:val="20"/>
         </w:rPr>
-        <w:t>Adevărul brutal</w:t>
+        <w:t>Plafonul vizibil</w:t>
       </w:r>
     </w:p>
     <w:p>
@@ -758,7 +758,7 @@
           <w:b w:val="0"/>
           <w:sz w:val="20"/>
         </w:rPr>
-        <w:t>Te uiți la un tabel. Astăzi am descoperit de ce nu era unul.</w:t>
+        <w:t>Ai un sistem. Astăzi am descoperit că tot eu îl pornesc.</w:t>
       </w:r>
     </w:p>
     <w:p>
@@ -787,7 +787,7 @@
           <w:b w:val="0"/>
           <w:sz w:val="20"/>
         </w:rPr>
-        <w:t>Suspiciune controlată</w:t>
+        <w:t>Judecata retragerii</w:t>
       </w:r>
     </w:p>
     <w:p>
@@ -806,7 +806,7 @@
           <w:b w:val="0"/>
           <w:sz w:val="20"/>
         </w:rPr>
-        <w:t>AI-ul nu repară. AI-ul scoate adevărul la suprafață.</w:t>
+        <w:t>AI-ul nu automatizează. AI-ul împarte ce iese din mâini și ce rămâne.</w:t>
       </w:r>
     </w:p>
     <w:p>
@@ -835,7 +835,7 @@
           <w:b w:val="0"/>
           <w:sz w:val="20"/>
         </w:rPr>
-        <w:t>Reconstrucție chirurgicală</w:t>
+        <w:t>Lanțul în mișcare</w:t>
       </w:r>
     </w:p>
     <w:p>
@@ -854,7 +854,7 @@
           <w:b w:val="0"/>
           <w:sz w:val="20"/>
         </w:rPr>
-        <w:t>Nu am reparat cifre. Am reconstruit infrastructura.</w:t>
+        <w:t>Nu am reîmprospătat date. Am legat pașii într-un lanț.</w:t>
       </w:r>
     </w:p>
     <w:p>
@@ -883,7 +883,7 @@
           <w:b w:val="0"/>
           <w:sz w:val="20"/>
         </w:rPr>
-        <w:t>Încredere câștigată</w:t>
+        <w:t>Dovada fără mâini</w:t>
       </w:r>
     </w:p>
     <w:p>
@@ -902,7 +902,7 @@
           <w:b w:val="0"/>
           <w:sz w:val="20"/>
         </w:rPr>
-        <w:t>Un proces care a rulat nu este un proces care a funcționat.</w:t>
+        <w:t>Un lanț care a pornit nu e un lanț care a scos omul din execuție.</w:t>
       </w:r>
     </w:p>
     <w:p>
@@ -931,7 +931,7 @@
           <w:b w:val="0"/>
           <w:sz w:val="20"/>
         </w:rPr>
-        <w:t>Permanență operațională</w:t>
+        <w:t>Intervenția minimă</w:t>
       </w:r>
     </w:p>
     <w:p>
@@ -950,7 +950,7 @@
           <w:b w:val="0"/>
           <w:sz w:val="20"/>
         </w:rPr>
-        <w:t>Un export curat astăzi este un export contaminat luna viitoare. Dacă nu există mecanism.</w:t>
+        <w:t>Un proces pornit de mine azi e tot munca mea mâine. Dacă nu iese din mâinile mele.</w:t>
       </w:r>
     </w:p>
     <w:p>
@@ -979,7 +979,7 @@
           <w:b w:val="0"/>
           <w:sz w:val="20"/>
         </w:rPr>
-        <w:t>Predarea către viitor</w:t>
+        <w:t>Predarea către C19</w:t>
       </w:r>
     </w:p>
     <w:p>
@@ -998,7 +998,7 @@
           <w:b w:val="0"/>
           <w:sz w:val="20"/>
         </w:rPr>
-        <w:t>Arată ca tabel. De data asta, chiar este.</w:t>
+        <w:t>Pornește dintr-o atingere. De data asta, merge fără mine.</w:t>
       </w:r>
     </w:p>
     <w:p>
@@ -1011,7 +1011,7 @@
           <w:color w:val="000000"/>
           <w:sz w:val="32"/>
         </w:rPr>
-        <w:t>DESCHIDERE · DE CE C01</w:t>
+        <w:t>DESCHIDERE · DE CE C18</w:t>
       </w:r>
     </w:p>
     <w:p>
@@ -1023,7 +1023,7 @@
           <w:rFonts w:ascii="Calibri" w:hAnsi="Calibri"/>
           <w:sz w:val="20"/>
         </w:rPr>
-        <w:t>Tabelul vine din ERP. Arată profesionist: anteturi pe trei rânduri, total general jos, separatoare între grupe, AutoFilter activat, SUM gata calculat. Aparența e impecabilă.</w:t>
+        <w:t>Munca vine cu un sistem (C17). Funcționează: are o formă reluabilă, pași cunoscuți, rezultat predictibil. Și totuși, la fiecare ciclu, tot tu o pornești, pas cu pas.</w:t>
       </w:r>
     </w:p>
     <w:p>
@@ -1035,7 +1035,7 @@
           <w:rFonts w:ascii="Calibri" w:hAnsi="Calibri"/>
           <w:sz w:val="20"/>
         </w:rPr>
-        <w:t>Problema nu este că datele lipsesc. Problema este că structura aparentă nu este structură reală. Header pe trei etaje înseamnă că Excel nu știe care este coloana 'data'. SUBTOTAL-uri intercalate înseamnă că orice formulă agregată va dubla sume. Rânduri blank de separator înseamnă că filtrul se oprește la primul. Coloană ascunsă cu cifre înseamnă că ochiul tău și SUM-ul nu văd același lucru. AutoFilter + SUM înseamnă că suma rămâne neschimbată chiar dacă filtrezi.</w:t>
+        <w:t>Problema nu este că sistemul lipsește. Problema este că „am un sistem” nu înseamnă „nu mai execut”. Un lanț pe care tot tu îl pornești te-a organizat, nu te-a scos din execuție. Omul rămâne veriga manuală: când e ocupat, ciclul așteaptă; între cicluri se strecoară variații; timpul de judecată se duce pe repetiție.</w:t>
       </w:r>
     </w:p>
     <w:p>
@@ -1047,7 +1047,7 @@
           <w:rFonts w:ascii="Calibri" w:hAnsi="Calibri"/>
           <w:sz w:val="20"/>
         </w:rPr>
-        <w:t>Conține 7 fenomene structurale demonstrabil prezente, toate vizibile sub forma de aparență de tabel curat. Construcția C01 ni le predă pe rând ca să le putem recunoaște la prima privire în orice export ERP viitor.</w:t>
+        <w:t>Conține fenomene de execuție manuală, observabile direct în workbook. Construcția C18 ni le arată pe rând ca să decidem ce merită scos din mâinile noastre și ce rămâne judecată.</w:t>
       </w:r>
     </w:p>
     <w:p>
@@ -1085,7 +1085,7 @@
           <w:rFonts w:ascii="Calibri" w:hAnsi="Calibri"/>
           <w:sz w:val="20"/>
         </w:rPr>
-        <w:t>Investighează tabelul ca instrument de audit structural. Raportează ce vede: tip header, prezență totaluri, coloane ascunse, separatoare. Nu decide, nu modifică, nu interpretează.</w:t>
+        <w:t>Împarte pașii ciclului: stabili și repetabili vs cer judecată. Propune clasificarea. Nu decide ce automatizezi, nu configurează unealta, nu se substituie omului.</w:t>
       </w:r>
     </w:p>
     <w:p>
@@ -1110,7 +1110,7 @@
           <w:rFonts w:ascii="Calibri" w:hAnsi="Calibri"/>
           <w:sz w:val="20"/>
         </w:rPr>
-        <w:t>Furnizează unelte moderne (AGGREGATE) care fac vizibilă contaminarea structurală fără să o repare. Aplică transformările cerute de noi, una câte una.</w:t>
+        <w:t>Furnizează lanțul (Power Query orchestrat, declanșator) ca MIJLOC. Execută secvența cerută de noi, fără ca mijlocul să devină identitatea.</w:t>
       </w:r>
     </w:p>
     <w:p>
@@ -1135,7 +1135,7 @@
           <w:rFonts w:ascii="Calibri" w:hAnsi="Calibri"/>
           <w:sz w:val="20"/>
         </w:rPr>
-        <w:t>Cerem demonstrația. Recunoaștem fiecare fenomen ca specie. Acceptăm transformarea controlată. Nu reconstruiește din nou, doar face structura controlabilă.</w:t>
+        <w:t>Decidem ce iese din mâini și ce rămâne. Marcăm intervenția minimă. Pornim lanțul o dată și luăm mâinile de pe tastatură.</w:t>
       </w:r>
     </w:p>
     <w:p>
@@ -1148,7 +1148,7 @@
           <w:color w:val="000000"/>
           <w:sz w:val="32"/>
         </w:rPr>
-        <w:t>SCENA REALĂ · CE PARE TABEL DAR NU ESTE</w:t>
+        <w:t>SCENA REALĂ · CE PARE AUTOMATIZARE DAR NU ESTE</w:t>
       </w:r>
     </w:p>
     <w:p>
@@ -1161,7 +1161,7 @@
           <w:color w:val="333333"/>
           <w:sz w:val="22"/>
         </w:rPr>
-        <w:t>01 · HEADER 3-ETAJ MERGED</w:t>
+        <w:t>01 · PASUL REPETAT MANUAL</w:t>
       </w:r>
     </w:p>
     <w:p>
@@ -1173,7 +1173,7 @@
           <w:rFonts w:ascii="Calibri" w:hAnsi="Calibri"/>
           <w:sz w:val="20"/>
         </w:rPr>
-        <w:t>Anteturi pe trei rânduri (rândurile 1-3), unele celule merged peste 3 coloane. Excel vede 'col_3 + col_4 + col_5' ca 'data' singură. Filtrul nu funcționează. Orice formulă citește coloane greșite.</w:t>
+        <w:t>Același pas (deschide, curăță, recalculează) refăcut cu mâna la fiecare ciclu. Stabil și repetabil: candidatul clar de scos din mâinile tale.</w:t>
       </w:r>
     </w:p>
     <w:p>
@@ -1186,7 +1186,7 @@
           <w:color w:val="333333"/>
           <w:sz w:val="22"/>
         </w:rPr>
-        <w:t>02 · SUBTOTAL/TOTAL PARAZITE</w:t>
+        <w:t>02 · REFRESH CONFUNDAT CU AUTOMATIZARE</w:t>
       </w:r>
     </w:p>
     <w:p>
@@ -1198,7 +1198,7 @@
           <w:rFonts w:ascii="Calibri" w:hAnsi="Calibri"/>
           <w:sz w:val="20"/>
         </w:rPr>
-        <w:t>4 rânduri SUBTOTAL după fiecare grup + 1 rând TOTAL GENERAL la final. Trec validare vizuală, dublează orice SUM agregat aplicat peste tabel.</w:t>
+        <w:t>Aduci datele la zi și crezi că ai automatizat. Dar tot tu faci pașii din jur. Refresh = C04, nu retragerea omului din lanț.</w:t>
       </w:r>
     </w:p>
     <w:p>
@@ -1211,7 +1211,7 @@
           <w:color w:val="333333"/>
           <w:sz w:val="22"/>
         </w:rPr>
-        <w:t>03 · COLOANĂ ASCUNSĂ FIZIC</w:t>
+        <w:t>03 · BUTONUL CA SCOP</w:t>
       </w:r>
     </w:p>
     <w:p>
@@ -1223,7 +1223,7 @@
           <w:rFonts w:ascii="Calibri" w:hAnsi="Calibri"/>
           <w:sz w:val="20"/>
         </w:rPr>
-        <w:t>Coloana J ascunsă în Excel (right-click → Hide). Conține cifre reale care intră în SUM dar nu apar la verificare ochi. Diferența între ce vezi și ce contorizezi Excel.</w:t>
+        <w:t>Un buton care impresionează, dar nu scoate niciun pas din execuție. Mecanismul nu e identitatea; lanțul care merge fără mâini este.</w:t>
       </w:r>
     </w:p>
     <w:p>
@@ -1236,7 +1236,7 @@
           <w:color w:val="333333"/>
           <w:sz w:val="22"/>
         </w:rPr>
-        <w:t>04 · RÂNDURI BLANK SEPARATOR</w:t>
+        <w:t>04 · AUTO-CONTROLUL PREMATUR</w:t>
       </w:r>
     </w:p>
     <w:p>
@@ -1248,7 +1248,7 @@
           <w:rFonts w:ascii="Calibri" w:hAnsi="Calibri"/>
           <w:sz w:val="20"/>
         </w:rPr>
-        <w:t>53 rânduri blank intercalate la fiecare 30-50 tranzacții, pretinse a fi 'pentru lizibilitate'. Filtrul AutoFilter se oprește la primul blank, ascunzând restul tabelului.</w:t>
+        <w:t>Praguri și validări care se autocorectează. Acela e C19, nu C18. C18 rulează, dar la un eșec încă te cheamă.</w:t>
       </w:r>
     </w:p>
     <w:p>
@@ -1261,7 +1261,7 @@
           <w:color w:val="333333"/>
           <w:sz w:val="22"/>
         </w:rPr>
-        <w:t>05 · CELL-MERGING CHAOTIC</w:t>
+        <w:t>05 · OWNERSHIP-UL DEGHIZAT</w:t>
       </w:r>
     </w:p>
     <w:p>
@@ -1273,7 +1273,7 @@
           <w:rFonts w:ascii="Calibri" w:hAnsi="Calibri"/>
           <w:sz w:val="20"/>
         </w:rPr>
-        <w:t>3 celule merged neregulat în corpul datelor, transformând rânduri de date în date-de-display. Sortarea pe acea coloană aruncă erori sau resetează tabelul.</w:t>
+        <w:t>„Cine deține și răspunde de proces?” Acela e C20. C18 e mișcare tehnică, nu desemnare de proprietar.</w:t>
       </w:r>
     </w:p>
     <w:p>
@@ -1286,7 +1286,7 @@
           <w:color w:val="333333"/>
           <w:sz w:val="22"/>
         </w:rPr>
-        <w:t>06 · AUTOFILTER + SUM ERONAT</w:t>
+        <w:t>06 · INTERVENȚIA MINIMĂ NEMARCATĂ</w:t>
       </w:r>
     </w:p>
     <w:p>
@@ -1298,7 +1298,7 @@
           <w:rFonts w:ascii="Calibri" w:hAnsi="Calibri"/>
           <w:sz w:val="20"/>
         </w:rPr>
-        <w:t>AutoFilter pre-activat + SUM tradițional pre-calculat. Filtrezi, SUM rămâne neschimbat (SUM nu respectă filtrul). Cifra arătată e o minciună a tabelului.</w:t>
+        <w:t>Pasul care cere judecată, lăsat nemarcat. Dacă nu spui unde mai intri tu, pretinzi fals că se face singur tot.</w:t>
       </w:r>
     </w:p>
     <w:p>
@@ -1311,7 +1311,7 @@
           <w:color w:val="333333"/>
           <w:sz w:val="22"/>
         </w:rPr>
-        <w:t>07 · AGGREGATE MODERN (FENOMEN POZITIV)</w:t>
+        <w:t>07 · MOTORUL (FENOMEN POZITIV)</w:t>
       </w:r>
     </w:p>
     <w:p>
@@ -1323,7 +1323,7 @@
           <w:rFonts w:ascii="Calibri" w:hAnsi="Calibri"/>
           <w:sz w:val="20"/>
         </w:rPr>
-        <w:t>Funcția AGGREGATE(9,5,...) ignoră subtotaluri și respectă filtrul. Este leacul nativ Excel pentru fenomenul 06. Predată la final ca soluție profesională.</w:t>
+        <w:t>Lanțul pornit dintr-o atingere care se duce până la capăt fără mâini, cu un singur punct de intervenție. Forma transformată în mișcare.</w:t>
       </w:r>
     </w:p>
     <w:p>
@@ -1335,7 +1335,7 @@
           <w:rFonts w:ascii="Calibri" w:hAnsi="Calibri"/>
           <w:sz w:val="20"/>
         </w:rPr>
-        <w:t>Total: 7 fenomene structurale demonstrabil prezente în tabelul predat ERP. 6 contaminate + 1 leac modern.</w:t>
+        <w:t>Total: 6 capcane de falsă automatizare + 1 motor real. Recunoaște-le, ca să automatizezi mișcarea, nu să decorezi forma.</w:t>
       </w:r>
     </w:p>
     <w:p>
@@ -1361,7 +1361,7 @@
           <w:color w:val="000000"/>
           <w:sz w:val="26"/>
         </w:rPr>
-        <w:t>ETAPA 1 · ARATĂ CA TABEL</w:t>
+        <w:t>ETAPA 1 · AI UN SISTEM, DAR TOT TU ÎL PORNEȘTI</w:t>
       </w:r>
     </w:p>
     <w:p>
@@ -1399,7 +1399,7 @@
           <w:rFonts w:ascii="Calibri" w:hAnsi="Calibri"/>
           <w:sz w:val="20"/>
         </w:rPr>
-        <w:t>Deschidem fișierul, recunoaște aparența impecabilă, fixează intenția de control.</w:t>
+        <w:t>Pornim sistemul C17 ca de obicei, numărăm atingerile manuale, fixăm intenția de retragere.</w:t>
       </w:r>
     </w:p>
     <w:p>
@@ -1424,7 +1424,7 @@
           <w:rFonts w:ascii="Calibri" w:hAnsi="Calibri"/>
           <w:sz w:val="20"/>
         </w:rPr>
-        <w:t>Recunoaștere acută. Asta arată ca orice tabel cu care lucrez zilnic. Și nu mă bazez pe el pentru decizii reale.</w:t>
+        <w:t>Recunoaștere acută. Am un sistem care merge. Și tot eu îl pornesc, de fiecare dată.</w:t>
       </w:r>
     </w:p>
     <w:p>
@@ -1450,7 +1450,7 @@
           <w:i/>
           <w:sz w:val="20"/>
         </w:rPr>
-        <w:t>„Arată ca tabel. Anteturi, totaluri, AutoFilter. Pare gata să fie analizat. Verific dacă este."</w:t>
+        <w:t>„Am un sistem. Pornește, produce, funcționează. Și tot prin mâinile mele trece, ciclu după ciclu."</w:t>
       </w:r>
     </w:p>
     <w:p>
@@ -1475,7 +1475,7 @@
           <w:rFonts w:ascii="Calibri" w:hAnsi="Calibri"/>
           <w:sz w:val="20"/>
         </w:rPr>
-        <w:t>Plan static pe ecranul Excel: 2.062 de rânduri, antet pe 3 nivele, rânduri SUBTOTAL evidențiate cu gri intercalat, TOTAL GENERAL jos. Cursorul navighează lent prin tabel, fără să apese vreun buton. Aparența predomină.</w:t>
+        <w:t>Plan pe ecranul Excel: pornim ciclul manual, pas cu pas. Deschide, curăță, recalculează, formatează. Contorul de atingeri urcă vizibil, gest după gest.</w:t>
       </w:r>
     </w:p>
     <w:p>
@@ -1500,7 +1500,7 @@
           <w:rFonts w:ascii="Calibri" w:hAnsi="Calibri"/>
           <w:sz w:val="20"/>
         </w:rPr>
-        <w:t>Încă nu intervine AI. Doar privire neutră asupra a ceea ce arată tabelul.</w:t>
+        <w:t>Încă nu intervine AI. Doar privim câte gesturi cere un ciclu.</w:t>
       </w:r>
     </w:p>
     <w:p>
@@ -1525,7 +1525,7 @@
           <w:rFonts w:ascii="Calibri" w:hAnsi="Calibri"/>
           <w:sz w:val="20"/>
         </w:rPr>
-        <w:t>Confirmăm martorul: "Suma de control vizibilă, fixată ca martor. Verific dacă această sumă este ce arată tabelul sau ce conține tabelul."</w:t>
+        <w:t>Fixăm contorul: "Atâtea atingeri cere un ciclu acum. La final văd dacă omul a ieșit din execuție."</w:t>
       </w:r>
     </w:p>
     <w:p>
@@ -1550,7 +1550,7 @@
           <w:rFonts w:ascii="Calibri" w:hAnsi="Calibri"/>
           <w:sz w:val="20"/>
         </w:rPr>
-        <w:t>Cursor pe rândul SUBTOTAL: cifra dublă apare odată în SUBTOTAL + odată în tranzacțiile de mai sus. Lumina galbenă apasă pe acel rând. Aparența cedează.</w:t>
+        <w:t>Contorul de atingeri se aprinde. Fiecare pas e mâna ta. A avea un sistem nu e încă automatizare.</w:t>
       </w:r>
     </w:p>
     <w:p>
@@ -1575,7 +1575,7 @@
           <w:rFonts w:ascii="Calibri" w:hAnsi="Calibri"/>
           <w:sz w:val="20"/>
         </w:rPr>
-        <w:t>Aparența nu este structură. Trecem la audit structural.</w:t>
+        <w:t>A avea un sistem nu e a fi ieșit din execuție. Trecem la judecata retragerii.</w:t>
       </w:r>
     </w:p>
     <w:p>
@@ -1588,7 +1588,7 @@
           <w:color w:val="000000"/>
           <w:sz w:val="26"/>
         </w:rPr>
-        <w:t>ETAPA 2 · AUDIT STRUCTURAL CU AI</w:t>
+        <w:t>ETAPA 2 · CE MERITĂ SCOS DIN MÂINILE TALE</w:t>
       </w:r>
     </w:p>
     <w:p>
@@ -1626,7 +1626,7 @@
           <w:rFonts w:ascii="Calibri" w:hAnsi="Calibri"/>
           <w:sz w:val="20"/>
         </w:rPr>
-        <w:t>AI auditează structura fișierului, raportează cele 6 fenomene contaminate + 1 leac modern. Datele rămân neatinse.</w:t>
+        <w:t>AI împarte pașii ciclului: stabili și repetabili vs cer judecată. Decidem noi ce iese din mâini.</w:t>
       </w:r>
     </w:p>
     <w:p>
@@ -1651,7 +1651,7 @@
           <w:rFonts w:ascii="Calibri" w:hAnsi="Calibri"/>
           <w:sz w:val="20"/>
         </w:rPr>
-        <w:t>Vigilență crescândă. Începi să vezi structura ca o specie cu probleme repetabile.</w:t>
+        <w:t>Vigilență crescândă. Începi să vezi pașii ca tipuri: unii mecanici, alții de judecată.</w:t>
       </w:r>
     </w:p>
     <w:p>
@@ -1677,7 +1677,7 @@
           <w:i/>
           <w:sz w:val="20"/>
         </w:rPr>
-        <w:t>„Nu repar. Întâi cer demonstrația. Promptul e instrument de audit structural, nu de execuție."</w:t>
+        <w:t>„Nu automatizez încă. Întâi judec ce merită scos din mâini. Promptul împarte, eu decid."</w:t>
       </w:r>
     </w:p>
     <w:p>
@@ -1702,7 +1702,7 @@
           <w:rFonts w:ascii="Calibri" w:hAnsi="Calibri"/>
           <w:sz w:val="20"/>
         </w:rPr>
-        <w:t>Copilot deschis în panoul lateral. Lipim promptul 1 (INSTRUMENT DE INVESTIGAȚIE). AI rulează. Datele nu se schimbă. Raportul apare în chat: 7 fenomene structurale identificate, cuantificate, localizate.</w:t>
+        <w:t>Copilot deschis pe foaia _AUTOMATIZARE. Lipim Promptul 1 (judecata retragerii). AI clasifică pașii: stabili+repetabili vs cer judecată. Datele nu se schimbă.</w:t>
       </w:r>
     </w:p>
     <w:p>
@@ -1727,7 +1727,7 @@
           <w:rFonts w:ascii="Calibri" w:hAnsi="Calibri"/>
           <w:sz w:val="20"/>
         </w:rPr>
-        <w:t>AI inspectează header (3 nivele merged), corpul (rânduri SUBTOTAL parazite), coloanele (J ascunsă), separatoare (53 blank), merging (3 chaotic), filtru + SUM, prezență AGGREGATE.</w:t>
+        <w:t>AI parcurge pașii ciclului: care se fac la fel de fiecare dată, care depind de context. Propune împărțirea în automatizabili și de-judecată.</w:t>
       </w:r>
     </w:p>
     <w:p>
@@ -1752,7 +1752,7 @@
           <w:rFonts w:ascii="Calibri" w:hAnsi="Calibri"/>
           <w:sz w:val="20"/>
         </w:rPr>
-        <w:t>Citim raportul cu voce tare: "Șapte fenomene structurale identificate. Șase contaminate. Unul leac. Acum știu ce întreb tabelul."</w:t>
+        <w:t>Citim împărțirea cu voce tare: "Pașii mecanici devin candidați de lanț. Pașii de judecată rămân ai mei. Acum știu ce scot."</w:t>
       </w:r>
     </w:p>
     <w:p>
@@ -1777,7 +1777,7 @@
           <w:rFonts w:ascii="Calibri" w:hAnsi="Calibri"/>
           <w:sz w:val="20"/>
         </w:rPr>
-        <w:t>Pe ecran apare un tabel cu cele 7 fenomene. Numerele sunt absolute: 2.062 rânduri din care 61 ambalaj eliminate (3 header + 4 SUBTOTAL + 1 TOTAL GENERAL + 53 FALSE BLANK), 14 coloane vizibile + 2 ascunse fizic. Demonstrabil. Cuantificat. Localizat.</w:t>
+        <w:t>Pe ecran: lista pașilor împărțită. Candidați de automatizare vs intervenție umană. Decidem noi, nu unealta.</w:t>
       </w:r>
     </w:p>
     <w:p>
@@ -1802,7 +1802,7 @@
           <w:rFonts w:ascii="Calibri" w:hAnsi="Calibri"/>
           <w:sz w:val="20"/>
         </w:rPr>
-        <w:t>Acum știm exact ce contaminează structura. Putem demonstra transformarea controlată.</w:t>
+        <w:t>Acum știm ce scoatem și ce ținem. Putem construi lanțul.</w:t>
       </w:r>
     </w:p>
     <w:p>
@@ -1815,7 +1815,7 @@
           <w:color w:val="000000"/>
           <w:sz w:val="26"/>
         </w:rPr>
-        <w:t>ETAPA 3 · TRANSFORMARE CONTROLATĂ</w:t>
+        <w:t>ETAPA 3 · PAȘII LEGAȚI ÎNTR-UN DECLANȘATOR</w:t>
       </w:r>
     </w:p>
     <w:p>
@@ -1853,7 +1853,7 @@
           <w:rFonts w:ascii="Calibri" w:hAnsi="Calibri"/>
           <w:sz w:val="20"/>
         </w:rPr>
-        <w:t>Aplicăm promptul 2 (INSTRUMENT DE TRANSFORMARE CONTROLATĂ). AI neutralizează fiecare fenomen contaminat, păstrează AGGREGATE ca leac modern. Zero rânduri suprimate ne-explicit.</w:t>
+        <w:t>Legăm pașii stabili într-un lanț pornit dintr-un singur declanșator. Power Query e mijlocul; lanțul e scopul.</w:t>
       </w:r>
     </w:p>
     <w:p>
@@ -1878,7 +1878,7 @@
           <w:rFonts w:ascii="Calibri" w:hAnsi="Calibri"/>
           <w:sz w:val="20"/>
         </w:rPr>
-        <w:t>Putere controlată. Fiecare contaminare are pasul ei. Nu inventez nimic, doar fac fenomenul invizibil.</w:t>
+        <w:t>Putere controlată. Fiecare pas stabil intră în lanț. Nu inventez, leg ce există.</w:t>
       </w:r>
     </w:p>
     <w:p>
@@ -1904,7 +1904,7 @@
           <w:i/>
           <w:sz w:val="20"/>
         </w:rPr>
-        <w:t>„Nu reconstruiesc. Fac controlabil. Header devine un singur rând. SUBTOTAL-urile dispar. Coloana ascunsă devine vizibilă. Blank-urile separator pleacă."</w:t>
+        <w:t>„Nu reîmprospătez. Leg pașii. Import, curățare, recalculare se înlănțuie. O atingere le pornește pe toate."</w:t>
       </w:r>
     </w:p>
     <w:p>
@@ -1929,7 +1929,7 @@
           <w:rFonts w:ascii="Calibri" w:hAnsi="Calibri"/>
           <w:sz w:val="20"/>
         </w:rPr>
-        <w:t>Promptul 2 lipit în Copilot. AI propune transformările pas cu pas. Confirmăm fiecare. Header devine 1 rând. 5 rânduri parazite (4 SUBTOTAL + 1 TOTAL) eliminate. 53 blank eliminate. Coloana J devine vizibilă. Cell-merging desfăcut. AutoFilter dezactivat. SUM tradițional înlocuit cu AGGREGATE.</w:t>
+        <w:t>Promptul 2 lipit. AI propune cum se leagă pașii într-un declanșator unic. Confirmăm fiecare. Punem un singur buton: RULEAZĂ CICLUL.</w:t>
       </w:r>
     </w:p>
     <w:p>
@@ -1954,7 +1954,7 @@
           <w:rFonts w:ascii="Calibri" w:hAnsi="Calibri"/>
           <w:sz w:val="20"/>
         </w:rPr>
-        <w:t>AI traduce intenția noastră în pași Excel concreți. Confirmă efectul fiecărui pas. Nu inițiază transformări pe care nu le înțelegem.</w:t>
+        <w:t>AI traduce intenția în pași de lanț. Confirmă efectul fiecăruia. Nu adaugă validări sau praguri (acela e C19).</w:t>
       </w:r>
     </w:p>
     <w:p>
@@ -1979,7 +1979,7 @@
           <w:rFonts w:ascii="Calibri" w:hAnsi="Calibri"/>
           <w:sz w:val="20"/>
         </w:rPr>
-        <w:t>Confirmăm martorul după fiecare pas major: "Header e acum un singur rând. Pot filtra. Pot sorta. Pot lua data ca data."</w:t>
+        <w:t>Confirmăm după fiecare pas: "Pașii stabili sunt legați. O atingere pornește secvența pe care o făceam manual."</w:t>
       </w:r>
     </w:p>
     <w:p>
@@ -2004,7 +2004,7 @@
           <w:rFonts w:ascii="Calibri" w:hAnsi="Calibri"/>
           <w:sz w:val="20"/>
         </w:rPr>
-        <w:t>Pe ecran: tabelul transformat. 2.000 rânduri tranzacții × 14 coloane vizibile. Header 1 rând. Zero SUBTOTAL. Zero blank. Zero merged. AGGREGATE activ. Aparența nu mai este reproducție. Este structură.</w:t>
+        <w:t>Pe ecran: un declanșator, o secvență care curge. Pașii pe care-i făceai cu mâna se execută singuri, în lanț.</w:t>
       </w:r>
     </w:p>
     <w:p>
@@ -2029,7 +2029,7 @@
           <w:rFonts w:ascii="Calibri" w:hAnsi="Calibri"/>
           <w:sz w:val="20"/>
         </w:rPr>
-        <w:t>Tabelul e acum controlabil. Verificăm martorul.</w:t>
+        <w:t>Lanțul pornește dintr-o atingere. Verificăm dacă un pas a ieșit cu adevărat din mâini.</w:t>
       </w:r>
     </w:p>
     <w:p>
@@ -2042,7 +2042,7 @@
           <w:color w:val="000000"/>
           <w:sz w:val="26"/>
         </w:rPr>
-        <w:t>ETAPA 4 · VERIFICARE CU AGGREGATE</w:t>
+        <w:t>ETAPA 4 · PASUL CARE DISPARE</w:t>
       </w:r>
     </w:p>
     <w:p>
@@ -2080,7 +2080,7 @@
           <w:rFonts w:ascii="Calibri" w:hAnsi="Calibri"/>
           <w:sz w:val="20"/>
         </w:rPr>
-        <w:t>AGGREGATE confirmă controlul de conservare după transformare. Suma rămâne conservată (sau diferență explicit motivată de transformare).</w:t>
+        <w:t>Verificăm că un pas manual a fost eliminat și rezultatul rămâne identic. Testul anti-refresh (C18 vs C04).</w:t>
       </w:r>
     </w:p>
     <w:p>
@@ -2105,7 +2105,7 @@
           <w:rFonts w:ascii="Calibri" w:hAnsi="Calibri"/>
           <w:sz w:val="20"/>
         </w:rPr>
-        <w:t>Calm controlat. Martorul este intact. Transformarea nu a inventat date.</w:t>
+        <w:t>Calm controlat. Pasul a ieșit din mâini. Valoarea netă nu s-a schimbat.</w:t>
       </w:r>
     </w:p>
     <w:p>
@@ -2131,7 +2131,7 @@
           <w:i/>
           <w:sz w:val="20"/>
         </w:rPr>
-        <w:t>„Verific cu AGGREGATE. Nu cu SUM. Vreau funcția care respectă filtrul, ignoră subtotalurile, vede doar tranzacții reale."</w:t>
+        <w:t>„Întreb: am eliminat un pas, sau doar am adus datele la zi? Dacă tot fac pașii din jur, e refresh, nu automatizare."</w:t>
       </w:r>
     </w:p>
     <w:p>
@@ -2156,7 +2156,7 @@
           <w:rFonts w:ascii="Calibri" w:hAnsi="Calibri"/>
           <w:sz w:val="20"/>
         </w:rPr>
-        <w:t>Cursor pe celula goală sub coloana valoare_neta. Scriem =AGGREGATE(9,5,...). Cifra apare: suma de control. Egal cu martorul inițial. Confirmare.</w:t>
+        <w:t>Marcăm un pas absorbit ca ELIMINAT. Rulăm lanțul. Comparăm valoarea netă cu cea făcută manual: identică.</w:t>
       </w:r>
     </w:p>
     <w:p>
@@ -2181,7 +2181,7 @@
           <w:rFonts w:ascii="Calibri" w:hAnsi="Calibri"/>
           <w:sz w:val="20"/>
         </w:rPr>
-        <w:t>AI nu mai intervine. Excel face singur.</w:t>
+        <w:t>AI nu mai intervine. Lanțul rulează singur.</w:t>
       </w:r>
     </w:p>
     <w:p>
@@ -2206,7 +2206,7 @@
           <w:rFonts w:ascii="Calibri" w:hAnsi="Calibri"/>
           <w:sz w:val="20"/>
         </w:rPr>
-        <w:t>Citim cu voce tare: "Suma de control conservată. Egal cu martorul. Transformarea e neutră semantic."</w:t>
+        <w:t>Citim cu voce tare: "Un pas a ieșit din execuție. Rezultatul e identic. Contorul de atingeri a scăzut."</w:t>
       </w:r>
     </w:p>
     <w:p>
@@ -2231,7 +2231,7 @@
           <w:rFonts w:ascii="Calibri" w:hAnsi="Calibri"/>
           <w:sz w:val="20"/>
         </w:rPr>
-        <w:t>Pe ecran: două numere identice. Martorul de la început, AGGREGATE după transformare. Identice. Demonstrabil.</w:t>
+        <w:t>Pe ecran: contorul de atingeri, ciclul 1 vs ciclul 2. Scădere vizibilă. Dovada retragerii.</w:t>
       </w:r>
     </w:p>
     <w:p>
@@ -2256,7 +2256,7 @@
           <w:rFonts w:ascii="Calibri" w:hAnsi="Calibri"/>
           <w:sz w:val="20"/>
         </w:rPr>
-        <w:t>Verificarea trece. Stabilizăm fluxul cu Power Query Refresh.</w:t>
+        <w:t>Eliminarea trece. Marcăm ce rămâne mâna omului.</w:t>
       </w:r>
     </w:p>
     <w:p>
@@ -2269,7 +2269,7 @@
           <w:color w:val="000000"/>
           <w:sz w:val="26"/>
         </w:rPr>
-        <w:t>ETAPA 5 · STABILIZARE CU POWER QUERY</w:t>
+        <w:t>ETAPA 5 · CE RĂMÂNE MÂNA OMULUI</w:t>
       </w:r>
     </w:p>
     <w:p>
@@ -2307,7 +2307,7 @@
           <w:rFonts w:ascii="Calibri" w:hAnsi="Calibri"/>
           <w:sz w:val="20"/>
         </w:rPr>
-        <w:t>Pașii de transformare sunt salvați ca flux Power Query. Refresh All re-aplică fluxul la orice export ERP viitor.</w:t>
+        <w:t>Marcăm explicit intervenția minimă rămasă. Lanțul rulează, dar nu se autoguvernează (granița C19).</w:t>
       </w:r>
     </w:p>
     <w:p>
@@ -2332,7 +2332,7 @@
           <w:rFonts w:ascii="Calibri" w:hAnsi="Calibri"/>
           <w:sz w:val="20"/>
         </w:rPr>
-        <w:t>Construcție durabilă. Munca de azi devine automatism pentru luna viitoare.</w:t>
+        <w:t>Onestitate operațională. Știu exact unde mai sunt necesar. Nu pretind că se face singur tot.</w:t>
       </w:r>
     </w:p>
     <w:p>
@@ -2358,7 +2358,7 @@
           <w:i/>
           <w:sz w:val="20"/>
         </w:rPr>
-        <w:t>„Nu vreau să refac asta luna viitoare. Vreau să apăs Refresh."</w:t>
+        <w:t>„Nu pretind autonomie totală. Marchez unde procesul mă așteaptă. Restul rulează fără mine."</w:t>
       </w:r>
     </w:p>
     <w:p>
@@ -2383,7 +2383,7 @@
           <w:rFonts w:ascii="Calibri" w:hAnsi="Calibri"/>
           <w:sz w:val="20"/>
         </w:rPr>
-        <w:t>Deschidem Data → From File → fișierul Excel original. Power Query Editor pornește. Promoted Headers, Removed Top Rows (3), Removed SUBTOTAL Rows, Removed TOTAL Row, Removed Blank Rows, Unhide Column. Fluxul are 6 Applied Steps vizibile lateral. Close &amp; Load.</w:t>
+        <w:t>Pe _AUTOMATIZARE: pași eliminați (tăiați), un declanșator, zona INTERVENȚIA MINIMĂ marcată cald. Fără praguri automate, fără validări care se autocorectează.</w:t>
       </w:r>
     </w:p>
     <w:p>
@@ -2408,7 +2408,7 @@
           <w:rFonts w:ascii="Calibri" w:hAnsi="Calibri"/>
           <w:sz w:val="20"/>
         </w:rPr>
-        <w:t>AI nu intervine. Power Query are propriul model declarativ. Învățăm sintaxa fluxului.</w:t>
+        <w:t>AI nu intervine. Decizia de unde rămâne omul e judecată umană, nu autocontrol.</w:t>
       </w:r>
     </w:p>
     <w:p>
@@ -2433,7 +2433,7 @@
           <w:rFonts w:ascii="Calibri" w:hAnsi="Calibri"/>
           <w:sz w:val="20"/>
         </w:rPr>
-        <w:t>Confirmăm martorul: "Fluxul e salvat. La luna viitoare apăs Refresh All. Cele 6 transformări se re-aplică pe noul export."</w:t>
+        <w:t>Confirmăm: "Lanțul rulează singur. La pasul de judecată, mă cheamă. Atât rămâne din mâinile mele."</w:t>
       </w:r>
     </w:p>
     <w:p>
@@ -2458,7 +2458,7 @@
           <w:rFonts w:ascii="Calibri" w:hAnsi="Calibri"/>
           <w:sz w:val="20"/>
         </w:rPr>
-        <w:t>Pe ecran: Excel Table denumit Vanzari, încărcat din Power Query. Refresh All buton evidentiat. Fluxul declarativ vizibil în panoul Queries. Stabilizat.</w:t>
+        <w:t>Pe ecran: harta _AUTOMATIZARE completă. Motor + un singur punct de intervenție. Forma s-a transformat în mișcare.</w:t>
       </w:r>
     </w:p>
     <w:p>
@@ -2483,7 +2483,7 @@
           <w:rFonts w:ascii="Calibri" w:hAnsi="Calibri"/>
           <w:sz w:val="20"/>
         </w:rPr>
-        <w:t>Fluxul e stabilizat. Predăm tabelul către construcția următoare cap-coadă.</w:t>
+        <w:t>Motorul e marcat. Îl testăm cu mâinile jos și îl predăm la C19.</w:t>
       </w:r>
     </w:p>
     <w:p>
@@ -2496,7 +2496,7 @@
           <w:color w:val="000000"/>
           <w:sz w:val="26"/>
         </w:rPr>
-        <w:t>ETAPA 6 · CONFIRMARE CAP-COADĂ</w:t>
+        <w:t>ETAPA 6 · TESTUL MÂINILE JOS</w:t>
       </w:r>
     </w:p>
     <w:p>
@@ -2534,7 +2534,7 @@
           <w:rFonts w:ascii="Calibri" w:hAnsi="Calibri"/>
           <w:sz w:val="20"/>
         </w:rPr>
-        <w:t>Tabelul Vanzari, structural curat, predat ca input către C02 CONTROLUL DATELOR.</w:t>
+        <w:t>Testul mâinile jos: declanșezi, iei mâinile, lanțul merge până la capăt. Predăm motorul către C19.</w:t>
       </w:r>
     </w:p>
     <w:p>
@@ -2559,7 +2559,7 @@
           <w:rFonts w:ascii="Calibri" w:hAnsi="Calibri"/>
           <w:sz w:val="20"/>
         </w:rPr>
-        <w:t>Predare conștientă. Nu confundăm "tabel curat structural" cu "date corecte operațional". Asta vine la C02.</w:t>
+        <w:t>Predare conștientă. Nu confund "rulează" cu "se autoguvernează". Asta vine la C19.</w:t>
       </w:r>
     </w:p>
     <w:p>
@@ -2585,7 +2585,7 @@
           <w:i/>
           <w:sz w:val="20"/>
         </w:rPr>
-        <w:t>„Structura e controlabilă. Datele pot fi încă greșite. C02 demonstrează unde mint datele în interior."</w:t>
+        <w:t>„Motorul rulează fără mine. Dar nu se ține singur încă. C19 îi adaugă reguli ca să se autoguverneze."</w:t>
       </w:r>
     </w:p>
     <w:p>
@@ -2610,7 +2610,7 @@
           <w:rFonts w:ascii="Calibri" w:hAnsi="Calibri"/>
           <w:sz w:val="20"/>
         </w:rPr>
-        <w:t>Tabel Vanzari × 14 coloane × 2.000 rânduri tranzacții. Suma de control verificată. Predat ca Date_MASTER-C01.xlsx (sheet Vanzari_Curat) către C02.</w:t>
+        <w:t>Lanț cu pași eliminați, un declanșator și o intervenție minimă marcată. Contorul de atingeri scăzut. Predat ca Date_MASTER-C18.xlsx (foaia _AUTOMATIZARE) către C19.</w:t>
       </w:r>
     </w:p>
     <w:p>
@@ -2635,7 +2635,7 @@
           <w:rFonts w:ascii="Calibri" w:hAnsi="Calibri"/>
           <w:sz w:val="20"/>
         </w:rPr>
-        <w:t>AI nu mai intervine în C01. Apare din nou la C02 cu prompturi de audit valoric.</w:t>
+        <w:t>AI nu mai intervine în C18. Reapare la C19 cu reguli și praguri de guvernare.</w:t>
       </w:r>
     </w:p>
     <w:p>
@@ -2660,7 +2660,7 @@
           <w:rFonts w:ascii="Calibri" w:hAnsi="Calibri"/>
           <w:sz w:val="20"/>
         </w:rPr>
-        <w:t>Rostim semnătura: "Nu am reconstruit tabelul. L-am făcut controlabil. Suma de control rămâne fixată. Predat către C02."</w:t>
+        <w:t>Rostim semnătura: "Nu o execut. O las să ruleze. Omul a ieșit din execuția repetitivă. Predat către C19."</w:t>
       </w:r>
     </w:p>
     <w:p>
@@ -2685,7 +2685,7 @@
           <w:rFonts w:ascii="Calibri" w:hAnsi="Calibri"/>
           <w:sz w:val="20"/>
         </w:rPr>
-        <w:t>Tranziție către C02. Slide final cu mesajul „Aparența nu se mai opune controlului. Tabelul e o structură demonstrabilă."</w:t>
+        <w:t>Tranziție către C19. Slide final cu mesajul „Munca nu mai trece prin mâinile tale la fiecare ciclu. Rulează demonstrabil fără tine."</w:t>
       </w:r>
     </w:p>
     <w:p>
@@ -2710,7 +2710,7 @@
           <w:rFonts w:ascii="Calibri" w:hAnsi="Calibri"/>
           <w:sz w:val="20"/>
         </w:rPr>
-        <w:t>C02 controlează datele DIN INTERIOR.</w:t>
+        <w:t>C19 face motorul să se țină singur.</w:t>
       </w:r>
     </w:p>
     <w:p>
@@ -2759,7 +2759,7 @@
           <w:rFonts w:ascii="Calibri" w:hAnsi="Calibri"/>
           <w:sz w:val="20"/>
         </w:rPr>
-        <w:t>Predat către C02 CONFRUNTAREA CU REALITATEA.</w:t>
+        <w:t>Predat către C19 GUVERNAREA.</w:t>
       </w:r>
     </w:p>
     <w:sectPr>

</xml_diff>